<commit_message>
Opschoning AI-typografie + totaalplaatje naar achter sectie 4
- Alle em/en-dashes, vóór/ná/óf/én/óók vervangen in alle bronbestanden en output
- WBSO.md opgeschoond
- Totaalplaatje-tabel verplaatst: nu na de losse bouwdelen (sectie 4), voor subsidies (sectie 5)

Co-Authored-By: Claude Sonnet 4.6 <noreply@anthropic.com>
</commit_message>
<xml_diff>
--- a/templates/Template_rapportage_quickscan.docx
+++ b/templates/Template_rapportage_quickscan.docx
@@ -6,6 +6,7 @@
       <w:pPr>
         <w:spacing w:before="1440" w:after="200"/>
       </w:pPr>
+      <w:proofErr w:type="spellStart"/>
       <w:r>
         <w:rPr>
           <w:rFonts w:ascii="Georgia" w:eastAsia="Georgia" w:hAnsi="Georgia" w:cs="Georgia"/>
@@ -28,6 +29,7 @@
         </w:rPr>
         <w:t>IQ</w:t>
       </w:r>
+      <w:proofErr w:type="spellEnd"/>
     </w:p>
     <w:p>
       <w:pPr>
@@ -76,8 +78,18 @@
           <w:sz w:val="32"/>
           <w:szCs w:val="32"/>
         </w:rPr>
-        <w:t>Isolatie Quickscan</w:t>
-      </w:r>
+        <w:t xml:space="preserve">Isolatie </w:t>
+      </w:r>
+      <w:proofErr w:type="spellStart"/>
+      <w:r>
+        <w:rPr>
+          <w:color w:val="5A6A85"/>
+          <w:sz w:val="32"/>
+          <w:szCs w:val="32"/>
+        </w:rPr>
+        <w:t>Quickscan</w:t>
+      </w:r>
+      <w:proofErr w:type="spellEnd"/>
     </w:p>
     <w:p>
       <w:pPr>
@@ -144,7 +156,21 @@
         <w:rPr>
           <w:color w:val="FFFFFF"/>
         </w:rPr>
-        <w:t>{{streetview}}</w:t>
+        <w:t>{{</w:t>
+      </w:r>
+      <w:proofErr w:type="spellStart"/>
+      <w:r>
+        <w:rPr>
+          <w:color w:val="FFFFFF"/>
+        </w:rPr>
+        <w:t>streetview</w:t>
+      </w:r>
+      <w:proofErr w:type="spellEnd"/>
+      <w:r>
+        <w:rPr>
+          <w:color w:val="FFFFFF"/>
+        </w:rPr>
+        <w:t>}}</w:t>
       </w:r>
     </w:p>
     <w:p>
@@ -197,7 +223,21 @@
         <w:rPr>
           <w:color w:val="1A2340"/>
         </w:rPr>
-        <w:t>{{narrative_gebouw}}</w:t>
+        <w:t>{{</w:t>
+      </w:r>
+      <w:proofErr w:type="spellStart"/>
+      <w:r>
+        <w:rPr>
+          <w:color w:val="1A2340"/>
+        </w:rPr>
+        <w:t>narrative_gebouw</w:t>
+      </w:r>
+      <w:proofErr w:type="spellEnd"/>
+      <w:r>
+        <w:rPr>
+          <w:color w:val="1A2340"/>
+        </w:rPr>
+        <w:t>}}</w:t>
       </w:r>
     </w:p>
     <w:p>
@@ -365,7 +405,21 @@
         <w:rPr>
           <w:color w:val="1A2340"/>
         </w:rPr>
-        <w:t>{{narrative_energie}}</w:t>
+        <w:t>{{</w:t>
+      </w:r>
+      <w:proofErr w:type="spellStart"/>
+      <w:r>
+        <w:rPr>
+          <w:color w:val="1A2340"/>
+        </w:rPr>
+        <w:t>narrative_energie</w:t>
+      </w:r>
+      <w:proofErr w:type="spellEnd"/>
+      <w:r>
+        <w:rPr>
+          <w:color w:val="1A2340"/>
+        </w:rPr>
+        <w:t>}}</w:t>
       </w:r>
     </w:p>
     <w:p>
@@ -471,7 +525,21 @@
         <w:rPr>
           <w:color w:val="1A2340"/>
         </w:rPr>
-        <w:t xml:space="preserve"> de gegevens kunnen onvolledig of onjuist zijn en PandIQ is niet aansprakelijk voor eventuele fouten of gevolgen van gebruik.</w:t>
+        <w:t xml:space="preserve"> de gegevens kunnen onvolledig of onjuist zijn en </w:t>
+      </w:r>
+      <w:proofErr w:type="spellStart"/>
+      <w:r>
+        <w:rPr>
+          <w:color w:val="1A2340"/>
+        </w:rPr>
+        <w:t>PandIQ</w:t>
+      </w:r>
+      <w:proofErr w:type="spellEnd"/>
+      <w:r>
+        <w:rPr>
+          <w:color w:val="1A2340"/>
+        </w:rPr>
+        <w:t xml:space="preserve"> is niet aansprakelijk voor eventuele fouten of gevolgen van gebruik.</w:t>
       </w:r>
     </w:p>
     <w:p>
@@ -909,7 +977,21 @@
               <w:rPr>
                 <w:color w:val="1A2340"/>
               </w:rPr>
-              <w:t>{{geldig_tot}}</w:t>
+              <w:t>{{</w:t>
+            </w:r>
+            <w:proofErr w:type="spellStart"/>
+            <w:r>
+              <w:rPr>
+                <w:color w:val="1A2340"/>
+              </w:rPr>
+              <w:t>geldig_tot</w:t>
+            </w:r>
+            <w:proofErr w:type="spellEnd"/>
+            <w:r>
+              <w:rPr>
+                <w:color w:val="1A2340"/>
+              </w:rPr>
+              <w:t>}}</w:t>
             </w:r>
           </w:p>
         </w:tc>
@@ -1097,7 +1179,21 @@
         <w:rPr>
           <w:color w:val="1A2340"/>
         </w:rPr>
-        <w:t>{{narrative_bouwperiode}}</w:t>
+        <w:t>{{</w:t>
+      </w:r>
+      <w:proofErr w:type="spellStart"/>
+      <w:r>
+        <w:rPr>
+          <w:color w:val="1A2340"/>
+        </w:rPr>
+        <w:t>narrative_bouwperiode</w:t>
+      </w:r>
+      <w:proofErr w:type="spellEnd"/>
+      <w:r>
+        <w:rPr>
+          <w:color w:val="1A2340"/>
+        </w:rPr>
+        <w:t>}}</w:t>
       </w:r>
     </w:p>
     <w:p>
@@ -1286,7 +1382,21 @@
               <w:rPr>
                 <w:color w:val="1A2340"/>
               </w:rPr>
-              <w:t>{{score_dak}}</w:t>
+              <w:t>{{</w:t>
+            </w:r>
+            <w:proofErr w:type="spellStart"/>
+            <w:r>
+              <w:rPr>
+                <w:color w:val="1A2340"/>
+              </w:rPr>
+              <w:t>score_dak</w:t>
+            </w:r>
+            <w:proofErr w:type="spellEnd"/>
+            <w:r>
+              <w:rPr>
+                <w:color w:val="1A2340"/>
+              </w:rPr>
+              <w:t>}}</w:t>
             </w:r>
             <w:r>
               <w:rPr>
@@ -1314,7 +1424,21 @@
               <w:rPr>
                 <w:color w:val="1A2340"/>
               </w:rPr>
-              <w:t>{{score_dak_tekst}}</w:t>
+              <w:t>{{</w:t>
+            </w:r>
+            <w:proofErr w:type="spellStart"/>
+            <w:r>
+              <w:rPr>
+                <w:color w:val="1A2340"/>
+              </w:rPr>
+              <w:t>score_dak_tekst</w:t>
+            </w:r>
+            <w:proofErr w:type="spellEnd"/>
+            <w:r>
+              <w:rPr>
+                <w:color w:val="1A2340"/>
+              </w:rPr>
+              <w:t>}}</w:t>
             </w:r>
           </w:p>
         </w:tc>
@@ -1358,7 +1482,21 @@
               <w:rPr>
                 <w:color w:val="1A2340"/>
               </w:rPr>
-              <w:t>{{score_gevel}}</w:t>
+              <w:t>{{</w:t>
+            </w:r>
+            <w:proofErr w:type="spellStart"/>
+            <w:r>
+              <w:rPr>
+                <w:color w:val="1A2340"/>
+              </w:rPr>
+              <w:t>score_gevel</w:t>
+            </w:r>
+            <w:proofErr w:type="spellEnd"/>
+            <w:r>
+              <w:rPr>
+                <w:color w:val="1A2340"/>
+              </w:rPr>
+              <w:t>}}</w:t>
             </w:r>
             <w:r>
               <w:rPr>
@@ -1386,7 +1524,21 @@
               <w:rPr>
                 <w:color w:val="1A2340"/>
               </w:rPr>
-              <w:t>{{score_gevel_tekst}}</w:t>
+              <w:t>{{</w:t>
+            </w:r>
+            <w:proofErr w:type="spellStart"/>
+            <w:r>
+              <w:rPr>
+                <w:color w:val="1A2340"/>
+              </w:rPr>
+              <w:t>score_gevel_tekst</w:t>
+            </w:r>
+            <w:proofErr w:type="spellEnd"/>
+            <w:r>
+              <w:rPr>
+                <w:color w:val="1A2340"/>
+              </w:rPr>
+              <w:t>}}</w:t>
             </w:r>
           </w:p>
         </w:tc>
@@ -1430,7 +1582,21 @@
               <w:rPr>
                 <w:color w:val="1A2340"/>
               </w:rPr>
-              <w:t>{{score_vloer}}</w:t>
+              <w:t>{{</w:t>
+            </w:r>
+            <w:proofErr w:type="spellStart"/>
+            <w:r>
+              <w:rPr>
+                <w:color w:val="1A2340"/>
+              </w:rPr>
+              <w:t>score_vloer</w:t>
+            </w:r>
+            <w:proofErr w:type="spellEnd"/>
+            <w:r>
+              <w:rPr>
+                <w:color w:val="1A2340"/>
+              </w:rPr>
+              <w:t>}}</w:t>
             </w:r>
             <w:r>
               <w:rPr>
@@ -1458,7 +1624,21 @@
               <w:rPr>
                 <w:color w:val="1A2340"/>
               </w:rPr>
-              <w:t>{{score_vloer_tekst}}</w:t>
+              <w:t>{{</w:t>
+            </w:r>
+            <w:proofErr w:type="spellStart"/>
+            <w:r>
+              <w:rPr>
+                <w:color w:val="1A2340"/>
+              </w:rPr>
+              <w:t>score_vloer_tekst</w:t>
+            </w:r>
+            <w:proofErr w:type="spellEnd"/>
+            <w:r>
+              <w:rPr>
+                <w:color w:val="1A2340"/>
+              </w:rPr>
+              <w:t>}}</w:t>
             </w:r>
           </w:p>
         </w:tc>
@@ -1502,7 +1682,21 @@
               <w:rPr>
                 <w:color w:val="1A2340"/>
               </w:rPr>
-              <w:t>{{score_glas}}</w:t>
+              <w:t>{{</w:t>
+            </w:r>
+            <w:proofErr w:type="spellStart"/>
+            <w:r>
+              <w:rPr>
+                <w:color w:val="1A2340"/>
+              </w:rPr>
+              <w:t>score_glas</w:t>
+            </w:r>
+            <w:proofErr w:type="spellEnd"/>
+            <w:r>
+              <w:rPr>
+                <w:color w:val="1A2340"/>
+              </w:rPr>
+              <w:t>}}</w:t>
             </w:r>
             <w:r>
               <w:rPr>
@@ -1530,7 +1724,21 @@
               <w:rPr>
                 <w:color w:val="1A2340"/>
               </w:rPr>
-              <w:t>{{score_glas_tekst}}</w:t>
+              <w:t>{{</w:t>
+            </w:r>
+            <w:proofErr w:type="spellStart"/>
+            <w:r>
+              <w:rPr>
+                <w:color w:val="1A2340"/>
+              </w:rPr>
+              <w:t>score_glas_tekst</w:t>
+            </w:r>
+            <w:proofErr w:type="spellEnd"/>
+            <w:r>
+              <w:rPr>
+                <w:color w:val="1A2340"/>
+              </w:rPr>
+              <w:t>}}</w:t>
             </w:r>
           </w:p>
         </w:tc>
@@ -1866,7 +2074,21 @@
         <w:rPr>
           <w:color w:val="1A2340"/>
         </w:rPr>
-        <w:t>{{narrative_aanpak}}</w:t>
+        <w:t>{{</w:t>
+      </w:r>
+      <w:proofErr w:type="spellStart"/>
+      <w:r>
+        <w:rPr>
+          <w:color w:val="1A2340"/>
+        </w:rPr>
+        <w:t>narrative_aanpak</w:t>
+      </w:r>
+      <w:proofErr w:type="spellEnd"/>
+      <w:r>
+        <w:rPr>
+          <w:color w:val="1A2340"/>
+        </w:rPr>
+        <w:t>}}</w:t>
       </w:r>
     </w:p>
     <w:p>
@@ -1903,7 +2125,21 @@
         <w:rPr>
           <w:color w:val="1A2340"/>
         </w:rPr>
-        <w:t>{{risicos}}</w:t>
+        <w:t>{{</w:t>
+      </w:r>
+      <w:proofErr w:type="spellStart"/>
+      <w:r>
+        <w:rPr>
+          <w:color w:val="1A2340"/>
+        </w:rPr>
+        <w:t>risicos</w:t>
+      </w:r>
+      <w:proofErr w:type="spellEnd"/>
+      <w:r>
+        <w:rPr>
+          <w:color w:val="1A2340"/>
+        </w:rPr>
+        <w:t>}}</w:t>
       </w:r>
     </w:p>
     <w:p>
@@ -1969,59 +2205,119 @@
     </w:p>
     <w:p>
       <w:pPr>
-        <w:pStyle w:val="Lijstalinea"/>
+        <w:spacing w:before="320" w:after="80"/>
+      </w:pPr>
+      <w:r>
+        <w:t>Controleer dit rapport en ontdek welke stappen u nu kunt zetten om uw woonlasten te verlagen en uw comfort te verbeteren.</w:t>
+      </w:r>
+      <w:r>
+        <w:t xml:space="preserve"> </w:t>
+      </w:r>
+      <w:proofErr w:type="spellStart"/>
+      <w:r>
+        <w:t>PandIQ</w:t>
+      </w:r>
+      <w:proofErr w:type="spellEnd"/>
+      <w:r>
+        <w:t xml:space="preserve"> begeleidt u stap voor stap door het hele traject.</w:t>
+      </w:r>
+    </w:p>
+    <w:p>
+      <w:pPr>
+        <w:spacing w:before="320" w:after="80"/>
+      </w:pPr>
+      <w:r>
+        <w:t xml:space="preserve">Via het </w:t>
+      </w:r>
+      <w:proofErr w:type="spellStart"/>
+      <w:r>
+        <w:t>PandIQ</w:t>
+      </w:r>
+      <w:proofErr w:type="spellEnd"/>
+      <w:r>
+        <w:t>-dashboard krijgt u vrijblijvend:</w:t>
+      </w:r>
+    </w:p>
+    <w:p>
+      <w:pPr>
         <w:numPr>
           <w:ilvl w:val="0"/>
-          <w:numId w:val="2"/>
+          <w:numId w:val="5"/>
         </w:numPr>
-        <w:spacing w:before="60" w:after="60"/>
-        <w:rPr>
-          <w:color w:val="FF0000"/>
-        </w:rPr>
-      </w:pPr>
-      <w:r>
-        <w:rPr>
-          <w:color w:val="FF0000"/>
-        </w:rPr>
-        <w:t>Upload foto’s van dak, gevel, glas, installaties en kruipruimte</w:t>
-      </w:r>
-    </w:p>
-    <w:p>
-      <w:pPr>
-        <w:pStyle w:val="Lijstalinea"/>
+        <w:spacing w:before="320" w:after="80"/>
+      </w:pPr>
+      <w:r>
+        <w:t xml:space="preserve">offertes op maat </w:t>
+      </w:r>
+    </w:p>
+    <w:p>
+      <w:pPr>
         <w:numPr>
           <w:ilvl w:val="0"/>
-          <w:numId w:val="2"/>
+          <w:numId w:val="5"/>
         </w:numPr>
-        <w:spacing w:before="60" w:after="60"/>
-        <w:rPr>
-          <w:color w:val="FF0000"/>
-        </w:rPr>
-      </w:pPr>
-      <w:r>
-        <w:rPr>
-          <w:color w:val="FF0000"/>
-        </w:rPr>
-        <w:t>Bevestig woningtype en eventuele renovatiejaren</w:t>
-      </w:r>
-    </w:p>
-    <w:p>
-      <w:pPr>
-        <w:pStyle w:val="Lijstalinea"/>
+        <w:spacing w:before="320" w:after="80"/>
+      </w:pPr>
+      <w:r>
+        <w:t xml:space="preserve">subsidie-inzicht en aanvraag </w:t>
+      </w:r>
+    </w:p>
+    <w:p>
+      <w:pPr>
         <w:numPr>
           <w:ilvl w:val="0"/>
-          <w:numId w:val="2"/>
+          <w:numId w:val="5"/>
         </w:numPr>
-        <w:spacing w:before="60" w:after="60"/>
-        <w:rPr>
-          <w:color w:val="FF0000"/>
-        </w:rPr>
-      </w:pPr>
-      <w:r>
-        <w:rPr>
-          <w:color w:val="FF0000"/>
-        </w:rPr>
-        <w:t>Gebruik dit rapport als basis voor offerte- of adviesgesprekken</w:t>
+        <w:spacing w:before="320" w:after="80"/>
+      </w:pPr>
+      <w:r>
+        <w:t xml:space="preserve">mogelijkheden voor financiering </w:t>
+      </w:r>
+    </w:p>
+    <w:p>
+      <w:pPr>
+        <w:numPr>
+          <w:ilvl w:val="0"/>
+          <w:numId w:val="5"/>
+        </w:numPr>
+        <w:spacing w:before="320" w:after="80"/>
+      </w:pPr>
+      <w:r>
+        <w:t xml:space="preserve">inzicht in lagere energiekosten </w:t>
+      </w:r>
+    </w:p>
+    <w:p>
+      <w:pPr>
+        <w:spacing w:before="320" w:after="80"/>
+      </w:pPr>
+      <w:r>
+        <w:br/>
+      </w:r>
+      <w:r>
+        <w:t>Laat geen besparing liggen.</w:t>
+      </w:r>
+    </w:p>
+    <w:p>
+      <w:pPr>
+        <w:spacing w:before="320" w:after="80"/>
+        <w:rPr>
+          <w:b/>
+          <w:bCs/>
+        </w:rPr>
+      </w:pPr>
+      <w:r>
+        <w:rPr>
+          <w:b/>
+          <w:bCs/>
+        </w:rPr>
+        <w:br/>
+      </w:r>
+      <w:r>
+        <w:rPr>
+          <w:b/>
+          <w:bCs/>
+        </w:rPr>
+        <w:t>Start vandaag en haal meer uit uw woning zonder verplichtingen.</w:t>
       </w:r>
     </w:p>
     <w:p>
@@ -2037,6 +2333,7 @@
           <w:szCs w:val="32"/>
         </w:rPr>
       </w:pPr>
+      <w:proofErr w:type="spellStart"/>
       <w:r>
         <w:rPr>
           <w:rFonts w:ascii="Georgia" w:eastAsia="Georgia" w:hAnsi="Georgia" w:cs="Georgia"/>
@@ -2059,6 +2356,7 @@
         </w:rPr>
         <w:t>IQ</w:t>
       </w:r>
+      <w:proofErr w:type="spellEnd"/>
       <w:r>
         <w:rPr>
           <w:rFonts w:ascii="Georgia" w:eastAsia="Georgia" w:hAnsi="Georgia" w:cs="Georgia"/>
@@ -2111,12 +2409,21 @@
           <w:szCs w:val="24"/>
         </w:rPr>
       </w:pPr>
+      <w:proofErr w:type="spellStart"/>
       <w:r>
         <w:rPr>
           <w:sz w:val="24"/>
           <w:szCs w:val="24"/>
         </w:rPr>
-        <w:t xml:space="preserve">PandIQ geeft u overzicht en helpt u met het inschatten van bouwkosten, het aanvragen van offertes, subsidieaanvragen en </w:t>
+        <w:t>PandIQ</w:t>
+      </w:r>
+      <w:proofErr w:type="spellEnd"/>
+      <w:r>
+        <w:rPr>
+          <w:sz w:val="24"/>
+          <w:szCs w:val="24"/>
+        </w:rPr>
+        <w:t xml:space="preserve"> geeft u overzicht en helpt u met het inschatten van bouwkosten, het aanvragen van offertes, subsidieaanvragen en </w:t>
       </w:r>
       <w:r>
         <w:rPr>
@@ -2302,7 +2609,25 @@
         <w:sz w:val="16"/>
         <w:szCs w:val="16"/>
       </w:rPr>
-      <w:t>Indicatief rapport · PandIQ · www.pandiq.nl</w:t>
+      <w:t xml:space="preserve">Indicatief rapport · </w:t>
+    </w:r>
+    <w:proofErr w:type="spellStart"/>
+    <w:r>
+      <w:rPr>
+        <w:color w:val="5A6A85"/>
+        <w:sz w:val="16"/>
+        <w:szCs w:val="16"/>
+      </w:rPr>
+      <w:t>PandIQ</w:t>
+    </w:r>
+    <w:proofErr w:type="spellEnd"/>
+    <w:r>
+      <w:rPr>
+        <w:color w:val="5A6A85"/>
+        <w:sz w:val="16"/>
+        <w:szCs w:val="16"/>
+      </w:rPr>
+      <w:t xml:space="preserve"> · www.pandiq.nl</w:t>
     </w:r>
     <w:r>
       <w:rPr>
@@ -2372,6 +2697,7 @@
           <w:vAlign w:val="center"/>
         </w:tcPr>
         <w:p>
+          <w:proofErr w:type="spellStart"/>
           <w:r>
             <w:rPr>
               <w:rFonts w:ascii="Georgia" w:eastAsia="Georgia" w:hAnsi="Georgia" w:cs="Georgia"/>
@@ -2394,6 +2720,7 @@
             </w:rPr>
             <w:t>IQ</w:t>
           </w:r>
+          <w:proofErr w:type="spellEnd"/>
         </w:p>
       </w:tc>
       <w:tc>
@@ -2417,8 +2744,18 @@
               <w:sz w:val="18"/>
               <w:szCs w:val="18"/>
             </w:rPr>
-            <w:t>Isolatie Quickscan</w:t>
+            <w:t xml:space="preserve">Isolatie </w:t>
           </w:r>
+          <w:proofErr w:type="spellStart"/>
+          <w:r>
+            <w:rPr>
+              <w:color w:val="5A6A85"/>
+              <w:sz w:val="18"/>
+              <w:szCs w:val="18"/>
+            </w:rPr>
+            <w:t>Quickscan</w:t>
+          </w:r>
+          <w:proofErr w:type="spellEnd"/>
         </w:p>
       </w:tc>
     </w:tr>
@@ -2574,6 +2911,155 @@
     </w:lvl>
   </w:abstractNum>
   <w:abstractNum w:abstractNumId="2" w15:restartNumberingAfterBreak="0">
+    <w:nsid w:val="468B099B"/>
+    <w:multiLevelType w:val="multilevel"/>
+    <w:tmpl w:val="78E68EC2"/>
+    <w:lvl w:ilvl="0">
+      <w:start w:val="1"/>
+      <w:numFmt w:val="bullet"/>
+      <w:lvlText w:val=""/>
+      <w:lvlJc w:val="left"/>
+      <w:pPr>
+        <w:tabs>
+          <w:tab w:val="num" w:pos="720"/>
+        </w:tabs>
+        <w:ind w:left="720" w:hanging="360"/>
+      </w:pPr>
+      <w:rPr>
+        <w:rFonts w:ascii="Symbol" w:hAnsi="Symbol" w:hint="default"/>
+        <w:sz w:val="20"/>
+      </w:rPr>
+    </w:lvl>
+    <w:lvl w:ilvl="1" w:tentative="1">
+      <w:start w:val="1"/>
+      <w:numFmt w:val="bullet"/>
+      <w:lvlText w:val="o"/>
+      <w:lvlJc w:val="left"/>
+      <w:pPr>
+        <w:tabs>
+          <w:tab w:val="num" w:pos="1440"/>
+        </w:tabs>
+        <w:ind w:left="1440" w:hanging="360"/>
+      </w:pPr>
+      <w:rPr>
+        <w:rFonts w:ascii="Courier New" w:hAnsi="Courier New" w:hint="default"/>
+        <w:sz w:val="20"/>
+      </w:rPr>
+    </w:lvl>
+    <w:lvl w:ilvl="2" w:tentative="1">
+      <w:start w:val="1"/>
+      <w:numFmt w:val="bullet"/>
+      <w:lvlText w:val=""/>
+      <w:lvlJc w:val="left"/>
+      <w:pPr>
+        <w:tabs>
+          <w:tab w:val="num" w:pos="2160"/>
+        </w:tabs>
+        <w:ind w:left="2160" w:hanging="360"/>
+      </w:pPr>
+      <w:rPr>
+        <w:rFonts w:ascii="Wingdings" w:hAnsi="Wingdings" w:hint="default"/>
+        <w:sz w:val="20"/>
+      </w:rPr>
+    </w:lvl>
+    <w:lvl w:ilvl="3" w:tentative="1">
+      <w:start w:val="1"/>
+      <w:numFmt w:val="bullet"/>
+      <w:lvlText w:val=""/>
+      <w:lvlJc w:val="left"/>
+      <w:pPr>
+        <w:tabs>
+          <w:tab w:val="num" w:pos="2880"/>
+        </w:tabs>
+        <w:ind w:left="2880" w:hanging="360"/>
+      </w:pPr>
+      <w:rPr>
+        <w:rFonts w:ascii="Wingdings" w:hAnsi="Wingdings" w:hint="default"/>
+        <w:sz w:val="20"/>
+      </w:rPr>
+    </w:lvl>
+    <w:lvl w:ilvl="4" w:tentative="1">
+      <w:start w:val="1"/>
+      <w:numFmt w:val="bullet"/>
+      <w:lvlText w:val=""/>
+      <w:lvlJc w:val="left"/>
+      <w:pPr>
+        <w:tabs>
+          <w:tab w:val="num" w:pos="3600"/>
+        </w:tabs>
+        <w:ind w:left="3600" w:hanging="360"/>
+      </w:pPr>
+      <w:rPr>
+        <w:rFonts w:ascii="Wingdings" w:hAnsi="Wingdings" w:hint="default"/>
+        <w:sz w:val="20"/>
+      </w:rPr>
+    </w:lvl>
+    <w:lvl w:ilvl="5" w:tentative="1">
+      <w:start w:val="1"/>
+      <w:numFmt w:val="bullet"/>
+      <w:lvlText w:val=""/>
+      <w:lvlJc w:val="left"/>
+      <w:pPr>
+        <w:tabs>
+          <w:tab w:val="num" w:pos="4320"/>
+        </w:tabs>
+        <w:ind w:left="4320" w:hanging="360"/>
+      </w:pPr>
+      <w:rPr>
+        <w:rFonts w:ascii="Wingdings" w:hAnsi="Wingdings" w:hint="default"/>
+        <w:sz w:val="20"/>
+      </w:rPr>
+    </w:lvl>
+    <w:lvl w:ilvl="6" w:tentative="1">
+      <w:start w:val="1"/>
+      <w:numFmt w:val="bullet"/>
+      <w:lvlText w:val=""/>
+      <w:lvlJc w:val="left"/>
+      <w:pPr>
+        <w:tabs>
+          <w:tab w:val="num" w:pos="5040"/>
+        </w:tabs>
+        <w:ind w:left="5040" w:hanging="360"/>
+      </w:pPr>
+      <w:rPr>
+        <w:rFonts w:ascii="Wingdings" w:hAnsi="Wingdings" w:hint="default"/>
+        <w:sz w:val="20"/>
+      </w:rPr>
+    </w:lvl>
+    <w:lvl w:ilvl="7" w:tentative="1">
+      <w:start w:val="1"/>
+      <w:numFmt w:val="bullet"/>
+      <w:lvlText w:val=""/>
+      <w:lvlJc w:val="left"/>
+      <w:pPr>
+        <w:tabs>
+          <w:tab w:val="num" w:pos="5760"/>
+        </w:tabs>
+        <w:ind w:left="5760" w:hanging="360"/>
+      </w:pPr>
+      <w:rPr>
+        <w:rFonts w:ascii="Wingdings" w:hAnsi="Wingdings" w:hint="default"/>
+        <w:sz w:val="20"/>
+      </w:rPr>
+    </w:lvl>
+    <w:lvl w:ilvl="8" w:tentative="1">
+      <w:start w:val="1"/>
+      <w:numFmt w:val="bullet"/>
+      <w:lvlText w:val=""/>
+      <w:lvlJc w:val="left"/>
+      <w:pPr>
+        <w:tabs>
+          <w:tab w:val="num" w:pos="6480"/>
+        </w:tabs>
+        <w:ind w:left="6480" w:hanging="360"/>
+      </w:pPr>
+      <w:rPr>
+        <w:rFonts w:ascii="Wingdings" w:hAnsi="Wingdings" w:hint="default"/>
+        <w:sz w:val="20"/>
+      </w:rPr>
+    </w:lvl>
+  </w:abstractNum>
+  <w:abstractNum w:abstractNumId="3" w15:restartNumberingAfterBreak="0">
     <w:nsid w:val="4FD55F3A"/>
     <w:multiLevelType w:val="hybridMultilevel"/>
     <w:tmpl w:val="1C36CA24"/>
@@ -2659,7 +3145,7 @@
       </w:pPr>
     </w:lvl>
   </w:abstractNum>
-  <w:abstractNum w:abstractNumId="3" w15:restartNumberingAfterBreak="0">
+  <w:abstractNum w:abstractNumId="4" w15:restartNumberingAfterBreak="0">
     <w:nsid w:val="72964827"/>
     <w:multiLevelType w:val="multilevel"/>
     <w:tmpl w:val="75189EAE"/>
@@ -2809,7 +3295,7 @@
     </w:lvl>
   </w:abstractNum>
   <w:num w:numId="1" w16cid:durableId="1737582796">
-    <w:abstractNumId w:val="2"/>
+    <w:abstractNumId w:val="3"/>
     <w:lvlOverride w:ilvl="0">
       <w:startOverride w:val="1"/>
     </w:lvlOverride>
@@ -2821,10 +3307,13 @@
     </w:lvlOverride>
   </w:num>
   <w:num w:numId="3" w16cid:durableId="2021732530">
-    <w:abstractNumId w:val="3"/>
+    <w:abstractNumId w:val="4"/>
   </w:num>
   <w:num w:numId="4" w16cid:durableId="1974408977">
     <w:abstractNumId w:val="1"/>
+  </w:num>
+  <w:num w:numId="5" w16cid:durableId="174806134">
+    <w:abstractNumId w:val="2"/>
   </w:num>
 </w:numbering>
 </file>
@@ -3316,7 +3805,6 @@
   <w:style w:type="character" w:default="1" w:styleId="Standaardalinea-lettertype">
     <w:name w:val="Default Paragraph Font"/>
     <w:uiPriority w:val="1"/>
-    <w:semiHidden/>
     <w:unhideWhenUsed/>
   </w:style>
   <w:style w:type="table" w:default="1" w:styleId="Standaardtabel">

</xml_diff>